<commit_message>
feat: gera tce oficial em docx
</commit_message>
<xml_diff>
--- a/assets/templates/tce/tce-obrigatorio-unip-v1.docx
+++ b/assets/templates/tce/tce-obrigatorio-unip-v1.docx
@@ -243,13 +243,23 @@
               <w:t>concedente_endereco</w:t>
             </w:r>
             <w:proofErr w:type="spellEnd"/>
-            <w:r>
-              <w:rPr>
-                <w:rFonts w:ascii="Arial" w:hAnsi="Arial" w:cs="Arial"/>
-                <w:sz w:val="24"/>
-                <w:szCs w:val="24"/>
-              </w:rPr>
-              <w:t>}}     nº {{</w:t>
+            <w:proofErr w:type="gramStart"/>
+            <w:r>
+              <w:rPr>
+                <w:rFonts w:ascii="Arial" w:hAnsi="Arial" w:cs="Arial"/>
+                <w:sz w:val="24"/>
+                <w:szCs w:val="24"/>
+              </w:rPr>
+              <w:t xml:space="preserve">}}   </w:t>
+            </w:r>
+            <w:proofErr w:type="gramEnd"/>
+            <w:r>
+              <w:rPr>
+                <w:rFonts w:ascii="Arial" w:hAnsi="Arial" w:cs="Arial"/>
+                <w:sz w:val="24"/>
+                <w:szCs w:val="24"/>
+              </w:rPr>
+              <w:t xml:space="preserve">  nº {{</w:t>
             </w:r>
             <w:proofErr w:type="spellStart"/>
             <w:r>
@@ -258,7 +268,16 @@
                 <w:sz w:val="24"/>
                 <w:szCs w:val="24"/>
               </w:rPr>
-              <w:t>concedente_numero</w:t>
+              <w:t>concedente_</w:t>
+            </w:r>
+            <w:proofErr w:type="gramStart"/>
+            <w:r>
+              <w:rPr>
+                <w:rFonts w:ascii="Arial" w:hAnsi="Arial" w:cs="Arial"/>
+                <w:sz w:val="24"/>
+                <w:szCs w:val="24"/>
+              </w:rPr>
+              <w:t>numero</w:t>
             </w:r>
             <w:proofErr w:type="spellEnd"/>
             <w:r>
@@ -267,7 +286,16 @@
                 <w:sz w:val="24"/>
                 <w:szCs w:val="24"/>
               </w:rPr>
-              <w:t>}}     Compl.: {{</w:t>
+              <w:t xml:space="preserve">}}   </w:t>
+            </w:r>
+            <w:proofErr w:type="gramEnd"/>
+            <w:r>
+              <w:rPr>
+                <w:rFonts w:ascii="Arial" w:hAnsi="Arial" w:cs="Arial"/>
+                <w:sz w:val="24"/>
+                <w:szCs w:val="24"/>
+              </w:rPr>
+              <w:t xml:space="preserve">  Compl.: {{</w:t>
             </w:r>
             <w:proofErr w:type="spellStart"/>
             <w:r>
@@ -329,13 +357,23 @@
               <w:t>concedente_bairro</w:t>
             </w:r>
             <w:proofErr w:type="spellEnd"/>
-            <w:r>
-              <w:rPr>
-                <w:rFonts w:ascii="Arial" w:hAnsi="Arial" w:cs="Arial"/>
-                <w:sz w:val="24"/>
-                <w:szCs w:val="24"/>
-              </w:rPr>
-              <w:t>}}    Município: {{</w:t>
+            <w:proofErr w:type="gramStart"/>
+            <w:r>
+              <w:rPr>
+                <w:rFonts w:ascii="Arial" w:hAnsi="Arial" w:cs="Arial"/>
+                <w:sz w:val="24"/>
+                <w:szCs w:val="24"/>
+              </w:rPr>
+              <w:t xml:space="preserve">}}   </w:t>
+            </w:r>
+            <w:proofErr w:type="gramEnd"/>
+            <w:r>
+              <w:rPr>
+                <w:rFonts w:ascii="Arial" w:hAnsi="Arial" w:cs="Arial"/>
+                <w:sz w:val="24"/>
+                <w:szCs w:val="24"/>
+              </w:rPr>
+              <w:t xml:space="preserve"> Município: {{</w:t>
             </w:r>
             <w:proofErr w:type="spellStart"/>
             <w:r>
@@ -347,13 +385,23 @@
               <w:t>concedente_municipio</w:t>
             </w:r>
             <w:proofErr w:type="spellEnd"/>
-            <w:r>
-              <w:rPr>
-                <w:rFonts w:ascii="Arial" w:hAnsi="Arial" w:cs="Arial"/>
-                <w:sz w:val="24"/>
-                <w:szCs w:val="24"/>
-              </w:rPr>
-              <w:t>}}    UF: {{</w:t>
+            <w:proofErr w:type="gramStart"/>
+            <w:r>
+              <w:rPr>
+                <w:rFonts w:ascii="Arial" w:hAnsi="Arial" w:cs="Arial"/>
+                <w:sz w:val="24"/>
+                <w:szCs w:val="24"/>
+              </w:rPr>
+              <w:t xml:space="preserve">}}   </w:t>
+            </w:r>
+            <w:proofErr w:type="gramEnd"/>
+            <w:r>
+              <w:rPr>
+                <w:rFonts w:ascii="Arial" w:hAnsi="Arial" w:cs="Arial"/>
+                <w:sz w:val="24"/>
+                <w:szCs w:val="24"/>
+              </w:rPr>
+              <w:t xml:space="preserve"> UF: {{</w:t>
             </w:r>
             <w:proofErr w:type="spellStart"/>
             <w:r>
@@ -365,13 +413,23 @@
               <w:t>concedente_uf</w:t>
             </w:r>
             <w:proofErr w:type="spellEnd"/>
-            <w:r>
-              <w:rPr>
-                <w:rFonts w:ascii="Arial" w:hAnsi="Arial" w:cs="Arial"/>
-                <w:sz w:val="24"/>
-                <w:szCs w:val="24"/>
-              </w:rPr>
-              <w:t>}}   CEP: {{</w:t>
+            <w:proofErr w:type="gramStart"/>
+            <w:r>
+              <w:rPr>
+                <w:rFonts w:ascii="Arial" w:hAnsi="Arial" w:cs="Arial"/>
+                <w:sz w:val="24"/>
+                <w:szCs w:val="24"/>
+              </w:rPr>
+              <w:t xml:space="preserve">}}   </w:t>
+            </w:r>
+            <w:proofErr w:type="gramEnd"/>
+            <w:r>
+              <w:rPr>
+                <w:rFonts w:ascii="Arial" w:hAnsi="Arial" w:cs="Arial"/>
+                <w:sz w:val="24"/>
+                <w:szCs w:val="24"/>
+              </w:rPr>
+              <w:t>CEP: {{</w:t>
             </w:r>
             <w:proofErr w:type="spellStart"/>
             <w:r>
@@ -383,13 +441,23 @@
               <w:t>concedente_cep</w:t>
             </w:r>
             <w:proofErr w:type="spellEnd"/>
-            <w:r>
-              <w:rPr>
-                <w:rFonts w:ascii="Arial" w:hAnsi="Arial" w:cs="Arial"/>
-                <w:sz w:val="24"/>
-                <w:szCs w:val="24"/>
-              </w:rPr>
-              <w:t xml:space="preserve">}}                              </w:t>
+            <w:proofErr w:type="gramStart"/>
+            <w:r>
+              <w:rPr>
+                <w:rFonts w:ascii="Arial" w:hAnsi="Arial" w:cs="Arial"/>
+                <w:sz w:val="24"/>
+                <w:szCs w:val="24"/>
+              </w:rPr>
+              <w:t xml:space="preserve">}}   </w:t>
+            </w:r>
+            <w:proofErr w:type="gramEnd"/>
+            <w:r>
+              <w:rPr>
+                <w:rFonts w:ascii="Arial" w:hAnsi="Arial" w:cs="Arial"/>
+                <w:sz w:val="24"/>
+                <w:szCs w:val="24"/>
+              </w:rPr>
+              <w:t xml:space="preserve">                           </w:t>
             </w:r>
           </w:p>
         </w:tc>
@@ -421,7 +489,7 @@
                 <w:sz w:val="24"/>
                 <w:szCs w:val="24"/>
               </w:rPr>
-              <w:t>Telefone: () {{</w:t>
+              <w:t>Telefone: {{</w:t>
             </w:r>
             <w:proofErr w:type="spellStart"/>
             <w:r>
@@ -433,13 +501,41 @@
               <w:t>concedente_telefone</w:t>
             </w:r>
             <w:proofErr w:type="spellEnd"/>
-            <w:r>
-              <w:rPr>
-                <w:rFonts w:ascii="Arial" w:hAnsi="Arial" w:cs="Arial"/>
-                <w:sz w:val="24"/>
-                <w:szCs w:val="24"/>
-              </w:rPr>
-              <w:t>}}      E-mail:  {{</w:t>
+            <w:proofErr w:type="gramStart"/>
+            <w:r>
+              <w:rPr>
+                <w:rFonts w:ascii="Arial" w:hAnsi="Arial" w:cs="Arial"/>
+                <w:sz w:val="24"/>
+                <w:szCs w:val="24"/>
+              </w:rPr>
+              <w:t xml:space="preserve">}}   </w:t>
+            </w:r>
+            <w:proofErr w:type="gramEnd"/>
+            <w:r>
+              <w:rPr>
+                <w:rFonts w:ascii="Arial" w:hAnsi="Arial" w:cs="Arial"/>
+                <w:sz w:val="24"/>
+                <w:szCs w:val="24"/>
+              </w:rPr>
+              <w:t xml:space="preserve">   E-mail</w:t>
+            </w:r>
+            <w:proofErr w:type="gramStart"/>
+            <w:r>
+              <w:rPr>
+                <w:rFonts w:ascii="Arial" w:hAnsi="Arial" w:cs="Arial"/>
+                <w:sz w:val="24"/>
+                <w:szCs w:val="24"/>
+              </w:rPr>
+              <w:t>:  {</w:t>
+            </w:r>
+            <w:proofErr w:type="gramEnd"/>
+            <w:r>
+              <w:rPr>
+                <w:rFonts w:ascii="Arial" w:hAnsi="Arial" w:cs="Arial"/>
+                <w:sz w:val="24"/>
+                <w:szCs w:val="24"/>
+              </w:rPr>
+              <w:t>{</w:t>
             </w:r>
             <w:proofErr w:type="spellStart"/>
             <w:r>
@@ -451,13 +547,23 @@
               <w:t>concedente_email</w:t>
             </w:r>
             <w:proofErr w:type="spellEnd"/>
-            <w:r>
-              <w:rPr>
-                <w:rFonts w:ascii="Arial" w:hAnsi="Arial" w:cs="Arial"/>
-                <w:sz w:val="24"/>
-                <w:szCs w:val="24"/>
-              </w:rPr>
-              <w:t xml:space="preserve">}}               </w:t>
+            <w:proofErr w:type="gramStart"/>
+            <w:r>
+              <w:rPr>
+                <w:rFonts w:ascii="Arial" w:hAnsi="Arial" w:cs="Arial"/>
+                <w:sz w:val="24"/>
+                <w:szCs w:val="24"/>
+              </w:rPr>
+              <w:t xml:space="preserve">}}   </w:t>
+            </w:r>
+            <w:proofErr w:type="gramEnd"/>
+            <w:r>
+              <w:rPr>
+                <w:rFonts w:ascii="Arial" w:hAnsi="Arial" w:cs="Arial"/>
+                <w:sz w:val="24"/>
+                <w:szCs w:val="24"/>
+              </w:rPr>
+              <w:t xml:space="preserve">            </w:t>
             </w:r>
           </w:p>
         </w:tc>
@@ -495,9 +601,19 @@
                 <w:sz w:val="24"/>
                 <w:szCs w:val="24"/>
               </w:rPr>
-              <w:t>concedente_local_estagio</w:t>
+              <w:t>concedente_local_</w:t>
+            </w:r>
+            <w:proofErr w:type="gramStart"/>
+            <w:r>
+              <w:rPr>
+                <w:rFonts w:ascii="Arial" w:hAnsi="Arial" w:cs="Arial"/>
+                <w:sz w:val="24"/>
+                <w:szCs w:val="24"/>
+              </w:rPr>
+              <w:t>estagio</w:t>
             </w:r>
             <w:proofErr w:type="spellEnd"/>
+            <w:proofErr w:type="gramEnd"/>
             <w:r>
               <w:rPr>
                 <w:rFonts w:ascii="Arial" w:hAnsi="Arial" w:cs="Arial"/>
@@ -548,13 +664,23 @@
               <w:t>concedente_local_endereco</w:t>
             </w:r>
             <w:proofErr w:type="spellEnd"/>
-            <w:r>
-              <w:rPr>
-                <w:rFonts w:ascii="Arial" w:hAnsi="Arial" w:cs="Arial"/>
-                <w:sz w:val="24"/>
-                <w:szCs w:val="24"/>
-              </w:rPr>
-              <w:t>}}    nº {{</w:t>
+            <w:proofErr w:type="gramStart"/>
+            <w:r>
+              <w:rPr>
+                <w:rFonts w:ascii="Arial" w:hAnsi="Arial" w:cs="Arial"/>
+                <w:sz w:val="24"/>
+                <w:szCs w:val="24"/>
+              </w:rPr>
+              <w:t xml:space="preserve">}}   </w:t>
+            </w:r>
+            <w:proofErr w:type="gramEnd"/>
+            <w:r>
+              <w:rPr>
+                <w:rFonts w:ascii="Arial" w:hAnsi="Arial" w:cs="Arial"/>
+                <w:sz w:val="24"/>
+                <w:szCs w:val="24"/>
+              </w:rPr>
+              <w:t xml:space="preserve"> nº {{</w:t>
             </w:r>
             <w:proofErr w:type="spellStart"/>
             <w:r>
@@ -563,7 +689,16 @@
                 <w:sz w:val="24"/>
                 <w:szCs w:val="24"/>
               </w:rPr>
-              <w:t>concedente_local_numero</w:t>
+              <w:t>concedente_local_</w:t>
+            </w:r>
+            <w:proofErr w:type="gramStart"/>
+            <w:r>
+              <w:rPr>
+                <w:rFonts w:ascii="Arial" w:hAnsi="Arial" w:cs="Arial"/>
+                <w:sz w:val="24"/>
+                <w:szCs w:val="24"/>
+              </w:rPr>
+              <w:t>numero</w:t>
             </w:r>
             <w:proofErr w:type="spellEnd"/>
             <w:r>
@@ -572,7 +707,16 @@
                 <w:sz w:val="24"/>
                 <w:szCs w:val="24"/>
               </w:rPr>
-              <w:t>}}    Compl.: {{</w:t>
+              <w:t xml:space="preserve">}}   </w:t>
+            </w:r>
+            <w:proofErr w:type="gramEnd"/>
+            <w:r>
+              <w:rPr>
+                <w:rFonts w:ascii="Arial" w:hAnsi="Arial" w:cs="Arial"/>
+                <w:sz w:val="24"/>
+                <w:szCs w:val="24"/>
+              </w:rPr>
+              <w:t xml:space="preserve"> Compl.: {{</w:t>
             </w:r>
             <w:proofErr w:type="spellStart"/>
             <w:r>
@@ -634,13 +778,23 @@
               <w:t>concedente_local_bairro</w:t>
             </w:r>
             <w:proofErr w:type="spellEnd"/>
-            <w:r>
-              <w:rPr>
-                <w:rFonts w:ascii="Arial" w:hAnsi="Arial" w:cs="Arial"/>
-                <w:sz w:val="24"/>
-                <w:szCs w:val="24"/>
-              </w:rPr>
-              <w:t>}}   Município: {{</w:t>
+            <w:proofErr w:type="gramStart"/>
+            <w:r>
+              <w:rPr>
+                <w:rFonts w:ascii="Arial" w:hAnsi="Arial" w:cs="Arial"/>
+                <w:sz w:val="24"/>
+                <w:szCs w:val="24"/>
+              </w:rPr>
+              <w:t xml:space="preserve">}}   </w:t>
+            </w:r>
+            <w:proofErr w:type="gramEnd"/>
+            <w:r>
+              <w:rPr>
+                <w:rFonts w:ascii="Arial" w:hAnsi="Arial" w:cs="Arial"/>
+                <w:sz w:val="24"/>
+                <w:szCs w:val="24"/>
+              </w:rPr>
+              <w:t>Município: {{</w:t>
             </w:r>
             <w:proofErr w:type="spellStart"/>
             <w:r>
@@ -652,13 +806,23 @@
               <w:t>concedente_local_municipio</w:t>
             </w:r>
             <w:proofErr w:type="spellEnd"/>
-            <w:r>
-              <w:rPr>
-                <w:rFonts w:ascii="Arial" w:hAnsi="Arial" w:cs="Arial"/>
-                <w:sz w:val="24"/>
-                <w:szCs w:val="24"/>
-              </w:rPr>
-              <w:t>}}   UF: {{</w:t>
+            <w:proofErr w:type="gramStart"/>
+            <w:r>
+              <w:rPr>
+                <w:rFonts w:ascii="Arial" w:hAnsi="Arial" w:cs="Arial"/>
+                <w:sz w:val="24"/>
+                <w:szCs w:val="24"/>
+              </w:rPr>
+              <w:t xml:space="preserve">}}   </w:t>
+            </w:r>
+            <w:proofErr w:type="gramEnd"/>
+            <w:r>
+              <w:rPr>
+                <w:rFonts w:ascii="Arial" w:hAnsi="Arial" w:cs="Arial"/>
+                <w:sz w:val="24"/>
+                <w:szCs w:val="24"/>
+              </w:rPr>
+              <w:t>UF: {{</w:t>
             </w:r>
             <w:proofErr w:type="spellStart"/>
             <w:r>
@@ -670,13 +834,23 @@
               <w:t>concedente_local_uf</w:t>
             </w:r>
             <w:proofErr w:type="spellEnd"/>
-            <w:r>
-              <w:rPr>
-                <w:rFonts w:ascii="Arial" w:hAnsi="Arial" w:cs="Arial"/>
-                <w:sz w:val="24"/>
-                <w:szCs w:val="24"/>
-              </w:rPr>
-              <w:t>}}   CEP: {{</w:t>
+            <w:proofErr w:type="gramStart"/>
+            <w:r>
+              <w:rPr>
+                <w:rFonts w:ascii="Arial" w:hAnsi="Arial" w:cs="Arial"/>
+                <w:sz w:val="24"/>
+                <w:szCs w:val="24"/>
+              </w:rPr>
+              <w:t xml:space="preserve">}}   </w:t>
+            </w:r>
+            <w:proofErr w:type="gramEnd"/>
+            <w:r>
+              <w:rPr>
+                <w:rFonts w:ascii="Arial" w:hAnsi="Arial" w:cs="Arial"/>
+                <w:sz w:val="24"/>
+                <w:szCs w:val="24"/>
+              </w:rPr>
+              <w:t>CEP: {{</w:t>
             </w:r>
             <w:proofErr w:type="spellStart"/>
             <w:r>
@@ -688,13 +862,23 @@
               <w:t>concedente_local_cep</w:t>
             </w:r>
             <w:proofErr w:type="spellEnd"/>
-            <w:r>
-              <w:rPr>
-                <w:rFonts w:ascii="Arial" w:hAnsi="Arial" w:cs="Arial"/>
-                <w:sz w:val="24"/>
-                <w:szCs w:val="24"/>
-              </w:rPr>
-              <w:t xml:space="preserve">}}                             </w:t>
+            <w:proofErr w:type="gramStart"/>
+            <w:r>
+              <w:rPr>
+                <w:rFonts w:ascii="Arial" w:hAnsi="Arial" w:cs="Arial"/>
+                <w:sz w:val="24"/>
+                <w:szCs w:val="24"/>
+              </w:rPr>
+              <w:t xml:space="preserve">}}   </w:t>
+            </w:r>
+            <w:proofErr w:type="gramEnd"/>
+            <w:r>
+              <w:rPr>
+                <w:rFonts w:ascii="Arial" w:hAnsi="Arial" w:cs="Arial"/>
+                <w:sz w:val="24"/>
+                <w:szCs w:val="24"/>
+              </w:rPr>
+              <w:t xml:space="preserve">                          </w:t>
             </w:r>
           </w:p>
         </w:tc>
@@ -726,7 +910,7 @@
                 <w:sz w:val="24"/>
                 <w:szCs w:val="24"/>
               </w:rPr>
-              <w:t>Telefone: () {{</w:t>
+              <w:t>Telefone: {{</w:t>
             </w:r>
             <w:proofErr w:type="spellStart"/>
             <w:r>
@@ -738,13 +922,23 @@
               <w:t>concedente_local_telefone</w:t>
             </w:r>
             <w:proofErr w:type="spellEnd"/>
-            <w:r>
-              <w:rPr>
-                <w:rFonts w:ascii="Arial" w:hAnsi="Arial" w:cs="Arial"/>
-                <w:sz w:val="24"/>
-                <w:szCs w:val="24"/>
-              </w:rPr>
-              <w:t>}}     E-mail: {{</w:t>
+            <w:proofErr w:type="gramStart"/>
+            <w:r>
+              <w:rPr>
+                <w:rFonts w:ascii="Arial" w:hAnsi="Arial" w:cs="Arial"/>
+                <w:sz w:val="24"/>
+                <w:szCs w:val="24"/>
+              </w:rPr>
+              <w:t xml:space="preserve">}}   </w:t>
+            </w:r>
+            <w:proofErr w:type="gramEnd"/>
+            <w:r>
+              <w:rPr>
+                <w:rFonts w:ascii="Arial" w:hAnsi="Arial" w:cs="Arial"/>
+                <w:sz w:val="24"/>
+                <w:szCs w:val="24"/>
+              </w:rPr>
+              <w:t xml:space="preserve">  E-mail: {{</w:t>
             </w:r>
             <w:proofErr w:type="spellStart"/>
             <w:r>
@@ -756,13 +950,23 @@
               <w:t>concedente_local_email</w:t>
             </w:r>
             <w:proofErr w:type="spellEnd"/>
-            <w:r>
-              <w:rPr>
-                <w:rFonts w:ascii="Arial" w:hAnsi="Arial" w:cs="Arial"/>
-                <w:sz w:val="24"/>
-                <w:szCs w:val="24"/>
-              </w:rPr>
-              <w:t xml:space="preserve">}}              </w:t>
+            <w:proofErr w:type="gramStart"/>
+            <w:r>
+              <w:rPr>
+                <w:rFonts w:ascii="Arial" w:hAnsi="Arial" w:cs="Arial"/>
+                <w:sz w:val="24"/>
+                <w:szCs w:val="24"/>
+              </w:rPr>
+              <w:t xml:space="preserve">}}   </w:t>
+            </w:r>
+            <w:proofErr w:type="gramEnd"/>
+            <w:r>
+              <w:rPr>
+                <w:rFonts w:ascii="Arial" w:hAnsi="Arial" w:cs="Arial"/>
+                <w:sz w:val="24"/>
+                <w:szCs w:val="24"/>
+              </w:rPr>
+              <w:t xml:space="preserve">           </w:t>
             </w:r>
           </w:p>
         </w:tc>
@@ -856,13 +1060,23 @@
               <w:t>concedente_rg_funcional</w:t>
             </w:r>
             <w:proofErr w:type="spellEnd"/>
-            <w:r>
-              <w:rPr>
-                <w:rFonts w:ascii="Arial" w:hAnsi="Arial" w:cs="Arial"/>
-                <w:sz w:val="24"/>
-                <w:szCs w:val="24"/>
-              </w:rPr>
-              <w:t>}}  Sigla Conselho Profissional e nº: {{</w:t>
+            <w:proofErr w:type="gramStart"/>
+            <w:r>
+              <w:rPr>
+                <w:rFonts w:ascii="Arial" w:hAnsi="Arial" w:cs="Arial"/>
+                <w:sz w:val="24"/>
+                <w:szCs w:val="24"/>
+              </w:rPr>
+              <w:t>}}  Sigla</w:t>
+            </w:r>
+            <w:proofErr w:type="gramEnd"/>
+            <w:r>
+              <w:rPr>
+                <w:rFonts w:ascii="Arial" w:hAnsi="Arial" w:cs="Arial"/>
+                <w:sz w:val="24"/>
+                <w:szCs w:val="24"/>
+              </w:rPr>
+              <w:t xml:space="preserve"> Conselho Profissional e nº: {{</w:t>
             </w:r>
             <w:proofErr w:type="spellStart"/>
             <w:r>
@@ -874,13 +1088,23 @@
               <w:t>concedente_conselho</w:t>
             </w:r>
             <w:proofErr w:type="spellEnd"/>
-            <w:r>
-              <w:rPr>
-                <w:rFonts w:ascii="Arial" w:hAnsi="Arial" w:cs="Arial"/>
-                <w:sz w:val="24"/>
-                <w:szCs w:val="24"/>
-              </w:rPr>
-              <w:t xml:space="preserve">}}                                                              </w:t>
+            <w:proofErr w:type="gramStart"/>
+            <w:r>
+              <w:rPr>
+                <w:rFonts w:ascii="Arial" w:hAnsi="Arial" w:cs="Arial"/>
+                <w:sz w:val="24"/>
+                <w:szCs w:val="24"/>
+              </w:rPr>
+              <w:t xml:space="preserve">}}   </w:t>
+            </w:r>
+            <w:proofErr w:type="gramEnd"/>
+            <w:r>
+              <w:rPr>
+                <w:rFonts w:ascii="Arial" w:hAnsi="Arial" w:cs="Arial"/>
+                <w:sz w:val="24"/>
+                <w:szCs w:val="24"/>
+              </w:rPr>
+              <w:t xml:space="preserve">                                                           </w:t>
             </w:r>
           </w:p>
         </w:tc>
@@ -955,7 +1179,25 @@
                 <w:sz w:val="24"/>
                 <w:szCs w:val="24"/>
               </w:rPr>
-              <w:t>Nome:  {{</w:t>
+              <w:t>Nome</w:t>
+            </w:r>
+            <w:proofErr w:type="gramStart"/>
+            <w:r>
+              <w:rPr>
+                <w:rFonts w:ascii="Arial" w:hAnsi="Arial" w:cs="Arial"/>
+                <w:sz w:val="24"/>
+                <w:szCs w:val="24"/>
+              </w:rPr>
+              <w:t>:  {</w:t>
+            </w:r>
+            <w:proofErr w:type="gramEnd"/>
+            <w:r>
+              <w:rPr>
+                <w:rFonts w:ascii="Arial" w:hAnsi="Arial" w:cs="Arial"/>
+                <w:sz w:val="24"/>
+                <w:szCs w:val="24"/>
+              </w:rPr>
+              <w:t>{</w:t>
             </w:r>
             <w:proofErr w:type="spellStart"/>
             <w:r>
@@ -967,13 +1209,23 @@
               <w:t>estagiario_nome</w:t>
             </w:r>
             <w:proofErr w:type="spellEnd"/>
-            <w:r>
-              <w:rPr>
-                <w:rFonts w:ascii="Arial" w:hAnsi="Arial" w:cs="Arial"/>
-                <w:sz w:val="24"/>
-                <w:szCs w:val="24"/>
-              </w:rPr>
-              <w:t xml:space="preserve">}}                                                                   </w:t>
+            <w:proofErr w:type="gramStart"/>
+            <w:r>
+              <w:rPr>
+                <w:rFonts w:ascii="Arial" w:hAnsi="Arial" w:cs="Arial"/>
+                <w:sz w:val="24"/>
+                <w:szCs w:val="24"/>
+              </w:rPr>
+              <w:t xml:space="preserve">}}   </w:t>
+            </w:r>
+            <w:proofErr w:type="gramEnd"/>
+            <w:r>
+              <w:rPr>
+                <w:rFonts w:ascii="Arial" w:hAnsi="Arial" w:cs="Arial"/>
+                <w:sz w:val="24"/>
+                <w:szCs w:val="24"/>
+              </w:rPr>
+              <w:t xml:space="preserve">                                                                </w:t>
             </w:r>
           </w:p>
         </w:tc>
@@ -1017,13 +1269,23 @@
               <w:t>estagiario_ra</w:t>
             </w:r>
             <w:proofErr w:type="spellEnd"/>
-            <w:r>
-              <w:rPr>
-                <w:rFonts w:ascii="Arial" w:hAnsi="Arial" w:cs="Arial"/>
-                <w:sz w:val="24"/>
-                <w:szCs w:val="24"/>
-              </w:rPr>
-              <w:t>}}                          Campus/Polo: {{</w:t>
+            <w:proofErr w:type="gramStart"/>
+            <w:r>
+              <w:rPr>
+                <w:rFonts w:ascii="Arial" w:hAnsi="Arial" w:cs="Arial"/>
+                <w:sz w:val="24"/>
+                <w:szCs w:val="24"/>
+              </w:rPr>
+              <w:t xml:space="preserve">}}   </w:t>
+            </w:r>
+            <w:proofErr w:type="gramEnd"/>
+            <w:r>
+              <w:rPr>
+                <w:rFonts w:ascii="Arial" w:hAnsi="Arial" w:cs="Arial"/>
+                <w:sz w:val="24"/>
+                <w:szCs w:val="24"/>
+              </w:rPr>
+              <w:t xml:space="preserve">                       Campus/Polo: {{</w:t>
             </w:r>
             <w:proofErr w:type="spellStart"/>
             <w:r>
@@ -1035,13 +1297,23 @@
               <w:t>estagiario_campus_polo</w:t>
             </w:r>
             <w:proofErr w:type="spellEnd"/>
-            <w:r>
-              <w:rPr>
-                <w:rFonts w:ascii="Arial" w:hAnsi="Arial" w:cs="Arial"/>
-                <w:sz w:val="24"/>
-                <w:szCs w:val="24"/>
-              </w:rPr>
-              <w:t xml:space="preserve">}}                        </w:t>
+            <w:proofErr w:type="gramStart"/>
+            <w:r>
+              <w:rPr>
+                <w:rFonts w:ascii="Arial" w:hAnsi="Arial" w:cs="Arial"/>
+                <w:sz w:val="24"/>
+                <w:szCs w:val="24"/>
+              </w:rPr>
+              <w:t xml:space="preserve">}}   </w:t>
+            </w:r>
+            <w:proofErr w:type="gramEnd"/>
+            <w:r>
+              <w:rPr>
+                <w:rFonts w:ascii="Arial" w:hAnsi="Arial" w:cs="Arial"/>
+                <w:sz w:val="24"/>
+                <w:szCs w:val="24"/>
+              </w:rPr>
+              <w:t xml:space="preserve">                     </w:t>
             </w:r>
           </w:p>
         </w:tc>
@@ -1085,13 +1357,23 @@
               <w:t>estagiario_curso</w:t>
             </w:r>
             <w:proofErr w:type="spellEnd"/>
-            <w:r>
-              <w:rPr>
-                <w:rFonts w:ascii="Arial" w:hAnsi="Arial" w:cs="Arial"/>
-                <w:sz w:val="24"/>
-                <w:szCs w:val="24"/>
-              </w:rPr>
-              <w:t>}}            Semestre: {{</w:t>
+            <w:proofErr w:type="gramStart"/>
+            <w:r>
+              <w:rPr>
+                <w:rFonts w:ascii="Arial" w:hAnsi="Arial" w:cs="Arial"/>
+                <w:sz w:val="24"/>
+                <w:szCs w:val="24"/>
+              </w:rPr>
+              <w:t xml:space="preserve">}}   </w:t>
+            </w:r>
+            <w:proofErr w:type="gramEnd"/>
+            <w:r>
+              <w:rPr>
+                <w:rFonts w:ascii="Arial" w:hAnsi="Arial" w:cs="Arial"/>
+                <w:sz w:val="24"/>
+                <w:szCs w:val="24"/>
+              </w:rPr>
+              <w:t xml:space="preserve">         Semestre: {{</w:t>
             </w:r>
             <w:proofErr w:type="spellStart"/>
             <w:r>
@@ -1103,13 +1385,23 @@
               <w:t>estagiario_semestre</w:t>
             </w:r>
             <w:proofErr w:type="spellEnd"/>
-            <w:r>
-              <w:rPr>
-                <w:rFonts w:ascii="Arial" w:hAnsi="Arial" w:cs="Arial"/>
-                <w:sz w:val="24"/>
-                <w:szCs w:val="24"/>
-              </w:rPr>
-              <w:t>}}         Turno: {{</w:t>
+            <w:proofErr w:type="gramStart"/>
+            <w:r>
+              <w:rPr>
+                <w:rFonts w:ascii="Arial" w:hAnsi="Arial" w:cs="Arial"/>
+                <w:sz w:val="24"/>
+                <w:szCs w:val="24"/>
+              </w:rPr>
+              <w:t xml:space="preserve">}}   </w:t>
+            </w:r>
+            <w:proofErr w:type="gramEnd"/>
+            <w:r>
+              <w:rPr>
+                <w:rFonts w:ascii="Arial" w:hAnsi="Arial" w:cs="Arial"/>
+                <w:sz w:val="24"/>
+                <w:szCs w:val="24"/>
+              </w:rPr>
+              <w:t xml:space="preserve">      Turno: {{</w:t>
             </w:r>
             <w:proofErr w:type="spellStart"/>
             <w:r>
@@ -1171,13 +1463,23 @@
               <w:t>estagiario_endereco</w:t>
             </w:r>
             <w:proofErr w:type="spellEnd"/>
-            <w:r>
-              <w:rPr>
-                <w:rFonts w:ascii="Arial" w:hAnsi="Arial" w:cs="Arial"/>
-                <w:sz w:val="24"/>
-                <w:szCs w:val="24"/>
-              </w:rPr>
-              <w:t>}}     nº {{</w:t>
+            <w:proofErr w:type="gramStart"/>
+            <w:r>
+              <w:rPr>
+                <w:rFonts w:ascii="Arial" w:hAnsi="Arial" w:cs="Arial"/>
+                <w:sz w:val="24"/>
+                <w:szCs w:val="24"/>
+              </w:rPr>
+              <w:t xml:space="preserve">}}   </w:t>
+            </w:r>
+            <w:proofErr w:type="gramEnd"/>
+            <w:r>
+              <w:rPr>
+                <w:rFonts w:ascii="Arial" w:hAnsi="Arial" w:cs="Arial"/>
+                <w:sz w:val="24"/>
+                <w:szCs w:val="24"/>
+              </w:rPr>
+              <w:t xml:space="preserve">  nº {{</w:t>
             </w:r>
             <w:proofErr w:type="spellStart"/>
             <w:r>
@@ -1186,7 +1488,16 @@
                 <w:sz w:val="24"/>
                 <w:szCs w:val="24"/>
               </w:rPr>
-              <w:t>estagiario_numero</w:t>
+              <w:t>estagiario_</w:t>
+            </w:r>
+            <w:proofErr w:type="gramStart"/>
+            <w:r>
+              <w:rPr>
+                <w:rFonts w:ascii="Arial" w:hAnsi="Arial" w:cs="Arial"/>
+                <w:sz w:val="24"/>
+                <w:szCs w:val="24"/>
+              </w:rPr>
+              <w:t>numero</w:t>
             </w:r>
             <w:proofErr w:type="spellEnd"/>
             <w:r>
@@ -1195,7 +1506,16 @@
                 <w:sz w:val="24"/>
                 <w:szCs w:val="24"/>
               </w:rPr>
-              <w:t>}}     Compl.: {{</w:t>
+              <w:t xml:space="preserve">}}   </w:t>
+            </w:r>
+            <w:proofErr w:type="gramEnd"/>
+            <w:r>
+              <w:rPr>
+                <w:rFonts w:ascii="Arial" w:hAnsi="Arial" w:cs="Arial"/>
+                <w:sz w:val="24"/>
+                <w:szCs w:val="24"/>
+              </w:rPr>
+              <w:t xml:space="preserve">  Compl.: {{</w:t>
             </w:r>
             <w:proofErr w:type="spellStart"/>
             <w:r>
@@ -1257,13 +1577,23 @@
               <w:t>estagiario_bairro</w:t>
             </w:r>
             <w:proofErr w:type="spellEnd"/>
-            <w:r>
-              <w:rPr>
-                <w:rFonts w:ascii="Arial" w:hAnsi="Arial" w:cs="Arial"/>
-                <w:sz w:val="24"/>
-                <w:szCs w:val="24"/>
-              </w:rPr>
-              <w:t>}}   Município: {{</w:t>
+            <w:proofErr w:type="gramStart"/>
+            <w:r>
+              <w:rPr>
+                <w:rFonts w:ascii="Arial" w:hAnsi="Arial" w:cs="Arial"/>
+                <w:sz w:val="24"/>
+                <w:szCs w:val="24"/>
+              </w:rPr>
+              <w:t xml:space="preserve">}}   </w:t>
+            </w:r>
+            <w:proofErr w:type="gramEnd"/>
+            <w:r>
+              <w:rPr>
+                <w:rFonts w:ascii="Arial" w:hAnsi="Arial" w:cs="Arial"/>
+                <w:sz w:val="24"/>
+                <w:szCs w:val="24"/>
+              </w:rPr>
+              <w:t>Município: {{</w:t>
             </w:r>
             <w:proofErr w:type="spellStart"/>
             <w:r>
@@ -1275,13 +1605,23 @@
               <w:t>estagiario_municipio</w:t>
             </w:r>
             <w:proofErr w:type="spellEnd"/>
-            <w:r>
-              <w:rPr>
-                <w:rFonts w:ascii="Arial" w:hAnsi="Arial" w:cs="Arial"/>
-                <w:sz w:val="24"/>
-                <w:szCs w:val="24"/>
-              </w:rPr>
-              <w:t>}}   UF: {{</w:t>
+            <w:proofErr w:type="gramStart"/>
+            <w:r>
+              <w:rPr>
+                <w:rFonts w:ascii="Arial" w:hAnsi="Arial" w:cs="Arial"/>
+                <w:sz w:val="24"/>
+                <w:szCs w:val="24"/>
+              </w:rPr>
+              <w:t xml:space="preserve">}}   </w:t>
+            </w:r>
+            <w:proofErr w:type="gramEnd"/>
+            <w:r>
+              <w:rPr>
+                <w:rFonts w:ascii="Arial" w:hAnsi="Arial" w:cs="Arial"/>
+                <w:sz w:val="24"/>
+                <w:szCs w:val="24"/>
+              </w:rPr>
+              <w:t>UF: {{</w:t>
             </w:r>
             <w:proofErr w:type="spellStart"/>
             <w:r>
@@ -1293,13 +1633,23 @@
               <w:t>estagiario_uf</w:t>
             </w:r>
             <w:proofErr w:type="spellEnd"/>
-            <w:r>
-              <w:rPr>
-                <w:rFonts w:ascii="Arial" w:hAnsi="Arial" w:cs="Arial"/>
-                <w:sz w:val="24"/>
-                <w:szCs w:val="24"/>
-              </w:rPr>
-              <w:t>}}   CEP: {{</w:t>
+            <w:proofErr w:type="gramStart"/>
+            <w:r>
+              <w:rPr>
+                <w:rFonts w:ascii="Arial" w:hAnsi="Arial" w:cs="Arial"/>
+                <w:sz w:val="24"/>
+                <w:szCs w:val="24"/>
+              </w:rPr>
+              <w:t xml:space="preserve">}}   </w:t>
+            </w:r>
+            <w:proofErr w:type="gramEnd"/>
+            <w:r>
+              <w:rPr>
+                <w:rFonts w:ascii="Arial" w:hAnsi="Arial" w:cs="Arial"/>
+                <w:sz w:val="24"/>
+                <w:szCs w:val="24"/>
+              </w:rPr>
+              <w:t>CEP: {{</w:t>
             </w:r>
             <w:proofErr w:type="spellStart"/>
             <w:r>
@@ -1311,13 +1661,23 @@
               <w:t>estagiario_cep</w:t>
             </w:r>
             <w:proofErr w:type="spellEnd"/>
-            <w:r>
-              <w:rPr>
-                <w:rFonts w:ascii="Arial" w:hAnsi="Arial" w:cs="Arial"/>
-                <w:sz w:val="24"/>
-                <w:szCs w:val="24"/>
-              </w:rPr>
-              <w:t xml:space="preserve">}}                             </w:t>
+            <w:proofErr w:type="gramStart"/>
+            <w:r>
+              <w:rPr>
+                <w:rFonts w:ascii="Arial" w:hAnsi="Arial" w:cs="Arial"/>
+                <w:sz w:val="24"/>
+                <w:szCs w:val="24"/>
+              </w:rPr>
+              <w:t xml:space="preserve">}}   </w:t>
+            </w:r>
+            <w:proofErr w:type="gramEnd"/>
+            <w:r>
+              <w:rPr>
+                <w:rFonts w:ascii="Arial" w:hAnsi="Arial" w:cs="Arial"/>
+                <w:sz w:val="24"/>
+                <w:szCs w:val="24"/>
+              </w:rPr>
+              <w:t xml:space="preserve">                          </w:t>
             </w:r>
           </w:p>
         </w:tc>
@@ -1349,7 +1709,7 @@
                 <w:sz w:val="24"/>
                 <w:szCs w:val="24"/>
               </w:rPr>
-              <w:t>Telefone: () {{</w:t>
+              <w:t>Telefone: {{</w:t>
             </w:r>
             <w:proofErr w:type="spellStart"/>
             <w:r>
@@ -1377,13 +1737,57 @@
               <w:t>rio_telefone</w:t>
             </w:r>
             <w:proofErr w:type="spellEnd"/>
-            <w:r>
-              <w:rPr>
-                <w:rFonts w:ascii="Arial" w:hAnsi="Arial" w:cs="Arial"/>
-                <w:sz w:val="24"/>
-                <w:szCs w:val="24"/>
-              </w:rPr>
-              <w:t>}}     E-mail: {{</w:t>
+            <w:proofErr w:type="gramStart"/>
+            <w:r>
+              <w:rPr>
+                <w:rFonts w:ascii="Arial" w:hAnsi="Arial" w:cs="Arial"/>
+                <w:sz w:val="24"/>
+                <w:szCs w:val="24"/>
+              </w:rPr>
+              <w:t xml:space="preserve">}}   </w:t>
+            </w:r>
+            <w:proofErr w:type="gramEnd"/>
+            <w:r>
+              <w:rPr>
+                <w:rFonts w:ascii="Arial" w:hAnsi="Arial" w:cs="Arial"/>
+                <w:sz w:val="24"/>
+                <w:szCs w:val="24"/>
+              </w:rPr>
+              <w:t xml:space="preserve">  E-mail</w:t>
+            </w:r>
+            <w:proofErr w:type="gramStart"/>
+            <w:r>
+              <w:rPr>
+                <w:rFonts w:ascii="Arial" w:hAnsi="Arial" w:cs="Arial"/>
+                <w:sz w:val="24"/>
+                <w:szCs w:val="24"/>
+              </w:rPr>
+              <w:t>:</w:t>
+            </w:r>
+            <w:r>
+              <w:rPr>
+                <w:rFonts w:ascii="Arial" w:hAnsi="Arial" w:cs="Arial"/>
+                <w:sz w:val="24"/>
+                <w:szCs w:val="24"/>
+              </w:rPr>
+              <w:t xml:space="preserve"> </w:t>
+            </w:r>
+            <w:r>
+              <w:rPr>
+                <w:rFonts w:ascii="Arial" w:hAnsi="Arial" w:cs="Arial"/>
+                <w:sz w:val="24"/>
+                <w:szCs w:val="24"/>
+              </w:rPr>
+              <w:t xml:space="preserve"> {</w:t>
+            </w:r>
+            <w:proofErr w:type="gramEnd"/>
+            <w:r>
+              <w:rPr>
+                <w:rFonts w:ascii="Arial" w:hAnsi="Arial" w:cs="Arial"/>
+                <w:sz w:val="24"/>
+                <w:szCs w:val="24"/>
+              </w:rPr>
+              <w:t>{</w:t>
             </w:r>
             <w:proofErr w:type="spellStart"/>
             <w:r>
@@ -1395,13 +1799,23 @@
               <w:t>estagiario_email</w:t>
             </w:r>
             <w:proofErr w:type="spellEnd"/>
-            <w:r>
-              <w:rPr>
-                <w:rFonts w:ascii="Arial" w:hAnsi="Arial" w:cs="Arial"/>
-                <w:sz w:val="24"/>
-                <w:szCs w:val="24"/>
-              </w:rPr>
-              <w:t xml:space="preserve">}}              </w:t>
+            <w:proofErr w:type="gramStart"/>
+            <w:r>
+              <w:rPr>
+                <w:rFonts w:ascii="Arial" w:hAnsi="Arial" w:cs="Arial"/>
+                <w:sz w:val="24"/>
+                <w:szCs w:val="24"/>
+              </w:rPr>
+              <w:t xml:space="preserve">}}   </w:t>
+            </w:r>
+            <w:proofErr w:type="gramEnd"/>
+            <w:r>
+              <w:rPr>
+                <w:rFonts w:ascii="Arial" w:hAnsi="Arial" w:cs="Arial"/>
+                <w:sz w:val="24"/>
+                <w:szCs w:val="24"/>
+              </w:rPr>
+              <w:t xml:space="preserve">           </w:t>
             </w:r>
           </w:p>
         </w:tc>
@@ -1730,15 +2144,34 @@
           <w:sz w:val="24"/>
           <w:szCs w:val="24"/>
         </w:rPr>
-        <w:t xml:space="preserve">Cláusula 2ª -  </w:t>
-      </w:r>
-      <w:r>
-        <w:rPr>
-          <w:rFonts w:ascii="Arial" w:hAnsi="Arial" w:cs="Arial"/>
-          <w:sz w:val="24"/>
-          <w:szCs w:val="24"/>
-        </w:rPr>
-        <w:t>O estágio</w:t>
+        <w:t xml:space="preserve">Cláusula 2ª </w:t>
+      </w:r>
+      <w:proofErr w:type="gramStart"/>
+      <w:r>
+        <w:rPr>
+          <w:rFonts w:ascii="Arial" w:hAnsi="Arial" w:cs="Arial"/>
+          <w:b/>
+          <w:sz w:val="24"/>
+          <w:szCs w:val="24"/>
+        </w:rPr>
+        <w:t xml:space="preserve">-  </w:t>
+      </w:r>
+      <w:r>
+        <w:rPr>
+          <w:rFonts w:ascii="Arial" w:hAnsi="Arial" w:cs="Arial"/>
+          <w:sz w:val="24"/>
+          <w:szCs w:val="24"/>
+        </w:rPr>
+        <w:t>O</w:t>
+      </w:r>
+      <w:proofErr w:type="gramEnd"/>
+      <w:r>
+        <w:rPr>
+          <w:rFonts w:ascii="Arial" w:hAnsi="Arial" w:cs="Arial"/>
+          <w:sz w:val="24"/>
+          <w:szCs w:val="24"/>
+        </w:rPr>
+        <w:t xml:space="preserve"> estágio</w:t>
       </w:r>
       <w:r>
         <w:rPr>
@@ -1896,7 +2329,25 @@
                 <w:sz w:val="24"/>
                 <w:szCs w:val="24"/>
               </w:rPr>
-              <w:t>vigencia_inicio_dia</w:t>
+              <w:t>vigencia_</w:t>
+            </w:r>
+            <w:proofErr w:type="gramStart"/>
+            <w:r>
+              <w:rPr>
+                <w:rFonts w:ascii="Arial" w:hAnsi="Arial" w:cs="Arial"/>
+                <w:sz w:val="24"/>
+                <w:szCs w:val="24"/>
+              </w:rPr>
+              <w:t>inicio</w:t>
+            </w:r>
+            <w:proofErr w:type="gramEnd"/>
+            <w:r>
+              <w:rPr>
+                <w:rFonts w:ascii="Arial" w:hAnsi="Arial" w:cs="Arial"/>
+                <w:sz w:val="24"/>
+                <w:szCs w:val="24"/>
+              </w:rPr>
+              <w:t>_dia</w:t>
             </w:r>
             <w:proofErr w:type="spellEnd"/>
             <w:r>
@@ -1914,7 +2365,25 @@
                 <w:sz w:val="24"/>
                 <w:szCs w:val="24"/>
               </w:rPr>
-              <w:t>vigencia_inicio_mes</w:t>
+              <w:t>vigencia_</w:t>
+            </w:r>
+            <w:proofErr w:type="gramStart"/>
+            <w:r>
+              <w:rPr>
+                <w:rFonts w:ascii="Arial" w:hAnsi="Arial" w:cs="Arial"/>
+                <w:sz w:val="24"/>
+                <w:szCs w:val="24"/>
+              </w:rPr>
+              <w:t>inicio</w:t>
+            </w:r>
+            <w:proofErr w:type="gramEnd"/>
+            <w:r>
+              <w:rPr>
+                <w:rFonts w:ascii="Arial" w:hAnsi="Arial" w:cs="Arial"/>
+                <w:sz w:val="24"/>
+                <w:szCs w:val="24"/>
+              </w:rPr>
+              <w:t>_mes</w:t>
             </w:r>
             <w:proofErr w:type="spellEnd"/>
             <w:r>
@@ -1932,7 +2401,25 @@
                 <w:sz w:val="24"/>
                 <w:szCs w:val="24"/>
               </w:rPr>
-              <w:t>vigencia_inicio_ano</w:t>
+              <w:t>vigencia_</w:t>
+            </w:r>
+            <w:proofErr w:type="gramStart"/>
+            <w:r>
+              <w:rPr>
+                <w:rFonts w:ascii="Arial" w:hAnsi="Arial" w:cs="Arial"/>
+                <w:sz w:val="24"/>
+                <w:szCs w:val="24"/>
+              </w:rPr>
+              <w:t>inicio</w:t>
+            </w:r>
+            <w:proofErr w:type="gramEnd"/>
+            <w:r>
+              <w:rPr>
+                <w:rFonts w:ascii="Arial" w:hAnsi="Arial" w:cs="Arial"/>
+                <w:sz w:val="24"/>
+                <w:szCs w:val="24"/>
+              </w:rPr>
+              <w:t>_ano</w:t>
             </w:r>
             <w:proofErr w:type="spellEnd"/>
             <w:r>
@@ -2162,9 +2649,19 @@
                       <w:sz w:val="24"/>
                       <w:szCs w:val="24"/>
                     </w:rPr>
-                    <w:t>segunda_inicio</w:t>
+                    <w:t>segunda_</w:t>
+                  </w:r>
+                  <w:proofErr w:type="gramStart"/>
+                  <w:r>
+                    <w:rPr>
+                      <w:rFonts w:ascii="Arial" w:hAnsi="Arial" w:cs="Arial"/>
+                      <w:sz w:val="24"/>
+                      <w:szCs w:val="24"/>
+                    </w:rPr>
+                    <w:t>inicio</w:t>
                   </w:r>
                   <w:proofErr w:type="spellEnd"/>
+                  <w:proofErr w:type="gramEnd"/>
                   <w:r>
                     <w:rPr>
                       <w:rFonts w:ascii="Arial" w:hAnsi="Arial" w:cs="Arial"/>
@@ -2228,9 +2725,19 @@
                       <w:sz w:val="24"/>
                       <w:szCs w:val="24"/>
                     </w:rPr>
-                    <w:t>segunda_intervalo_inicio</w:t>
+                    <w:t>segunda_intervalo_</w:t>
+                  </w:r>
+                  <w:proofErr w:type="gramStart"/>
+                  <w:r>
+                    <w:rPr>
+                      <w:rFonts w:ascii="Arial" w:hAnsi="Arial" w:cs="Arial"/>
+                      <w:sz w:val="24"/>
+                      <w:szCs w:val="24"/>
+                    </w:rPr>
+                    <w:t>inicio</w:t>
                   </w:r>
                   <w:proofErr w:type="spellEnd"/>
+                  <w:proofErr w:type="gramEnd"/>
                   <w:r>
                     <w:rPr>
                       <w:rFonts w:ascii="Arial" w:hAnsi="Arial" w:cs="Arial"/>
@@ -2331,9 +2838,19 @@
                       <w:sz w:val="24"/>
                       <w:szCs w:val="24"/>
                     </w:rPr>
-                    <w:t>terca_inicio</w:t>
+                    <w:t>terca_</w:t>
+                  </w:r>
+                  <w:proofErr w:type="gramStart"/>
+                  <w:r>
+                    <w:rPr>
+                      <w:rFonts w:ascii="Arial" w:hAnsi="Arial" w:cs="Arial"/>
+                      <w:sz w:val="24"/>
+                      <w:szCs w:val="24"/>
+                    </w:rPr>
+                    <w:t>inicio</w:t>
                   </w:r>
                   <w:proofErr w:type="spellEnd"/>
+                  <w:proofErr w:type="gramEnd"/>
                   <w:r>
                     <w:rPr>
                       <w:rFonts w:ascii="Arial" w:hAnsi="Arial" w:cs="Arial"/>
@@ -2397,9 +2914,19 @@
                       <w:sz w:val="24"/>
                       <w:szCs w:val="24"/>
                     </w:rPr>
-                    <w:t>terca_intervalo_inicio</w:t>
+                    <w:t>terca_intervalo_</w:t>
+                  </w:r>
+                  <w:proofErr w:type="gramStart"/>
+                  <w:r>
+                    <w:rPr>
+                      <w:rFonts w:ascii="Arial" w:hAnsi="Arial" w:cs="Arial"/>
+                      <w:sz w:val="24"/>
+                      <w:szCs w:val="24"/>
+                    </w:rPr>
+                    <w:t>inicio</w:t>
                   </w:r>
                   <w:proofErr w:type="spellEnd"/>
+                  <w:proofErr w:type="gramEnd"/>
                   <w:r>
                     <w:rPr>
                       <w:rFonts w:ascii="Arial" w:hAnsi="Arial" w:cs="Arial"/>
@@ -2500,9 +3027,19 @@
                       <w:sz w:val="24"/>
                       <w:szCs w:val="24"/>
                     </w:rPr>
-                    <w:t>quarta_inicio</w:t>
+                    <w:t>quarta_</w:t>
+                  </w:r>
+                  <w:proofErr w:type="gramStart"/>
+                  <w:r>
+                    <w:rPr>
+                      <w:rFonts w:ascii="Arial" w:hAnsi="Arial" w:cs="Arial"/>
+                      <w:sz w:val="24"/>
+                      <w:szCs w:val="24"/>
+                    </w:rPr>
+                    <w:t>inicio</w:t>
                   </w:r>
                   <w:proofErr w:type="spellEnd"/>
+                  <w:proofErr w:type="gramEnd"/>
                   <w:r>
                     <w:rPr>
                       <w:rFonts w:ascii="Arial" w:hAnsi="Arial" w:cs="Arial"/>
@@ -2566,9 +3103,19 @@
                       <w:sz w:val="24"/>
                       <w:szCs w:val="24"/>
                     </w:rPr>
-                    <w:t>quarta_intervalo_inicio</w:t>
+                    <w:t>quarta_intervalo_</w:t>
+                  </w:r>
+                  <w:proofErr w:type="gramStart"/>
+                  <w:r>
+                    <w:rPr>
+                      <w:rFonts w:ascii="Arial" w:hAnsi="Arial" w:cs="Arial"/>
+                      <w:sz w:val="24"/>
+                      <w:szCs w:val="24"/>
+                    </w:rPr>
+                    <w:t>inicio</w:t>
                   </w:r>
                   <w:proofErr w:type="spellEnd"/>
+                  <w:proofErr w:type="gramEnd"/>
                   <w:r>
                     <w:rPr>
                       <w:rFonts w:ascii="Arial" w:hAnsi="Arial" w:cs="Arial"/>
@@ -2669,9 +3216,19 @@
                       <w:sz w:val="24"/>
                       <w:szCs w:val="24"/>
                     </w:rPr>
-                    <w:t>quinta_inicio</w:t>
+                    <w:t>quinta_</w:t>
+                  </w:r>
+                  <w:proofErr w:type="gramStart"/>
+                  <w:r>
+                    <w:rPr>
+                      <w:rFonts w:ascii="Arial" w:hAnsi="Arial" w:cs="Arial"/>
+                      <w:sz w:val="24"/>
+                      <w:szCs w:val="24"/>
+                    </w:rPr>
+                    <w:t>inicio</w:t>
                   </w:r>
                   <w:proofErr w:type="spellEnd"/>
+                  <w:proofErr w:type="gramEnd"/>
                   <w:r>
                     <w:rPr>
                       <w:rFonts w:ascii="Arial" w:hAnsi="Arial" w:cs="Arial"/>
@@ -2735,9 +3292,19 @@
                       <w:sz w:val="24"/>
                       <w:szCs w:val="24"/>
                     </w:rPr>
-                    <w:t>quinta_intervalo_inicio</w:t>
+                    <w:t>quinta_intervalo_</w:t>
+                  </w:r>
+                  <w:proofErr w:type="gramStart"/>
+                  <w:r>
+                    <w:rPr>
+                      <w:rFonts w:ascii="Arial" w:hAnsi="Arial" w:cs="Arial"/>
+                      <w:sz w:val="24"/>
+                      <w:szCs w:val="24"/>
+                    </w:rPr>
+                    <w:t>inicio</w:t>
                   </w:r>
                   <w:proofErr w:type="spellEnd"/>
+                  <w:proofErr w:type="gramEnd"/>
                   <w:r>
                     <w:rPr>
                       <w:rFonts w:ascii="Arial" w:hAnsi="Arial" w:cs="Arial"/>
@@ -2854,9 +3421,19 @@
                       <w:sz w:val="24"/>
                       <w:szCs w:val="24"/>
                     </w:rPr>
-                    <w:t>a_inicio</w:t>
+                    <w:t>a_</w:t>
+                  </w:r>
+                  <w:proofErr w:type="gramStart"/>
+                  <w:r>
+                    <w:rPr>
+                      <w:rFonts w:ascii="Arial" w:hAnsi="Arial" w:cs="Arial"/>
+                      <w:sz w:val="24"/>
+                      <w:szCs w:val="24"/>
+                    </w:rPr>
+                    <w:t>inicio</w:t>
                   </w:r>
                   <w:proofErr w:type="spellEnd"/>
+                  <w:proofErr w:type="gramEnd"/>
                   <w:r>
                     <w:rPr>
                       <w:rFonts w:ascii="Arial" w:hAnsi="Arial" w:cs="Arial"/>
@@ -2920,9 +3497,19 @@
                       <w:sz w:val="24"/>
                       <w:szCs w:val="24"/>
                     </w:rPr>
-                    <w:t>sexta_intervalo_inicio</w:t>
+                    <w:t>sexta_intervalo_</w:t>
+                  </w:r>
+                  <w:proofErr w:type="gramStart"/>
+                  <w:r>
+                    <w:rPr>
+                      <w:rFonts w:ascii="Arial" w:hAnsi="Arial" w:cs="Arial"/>
+                      <w:sz w:val="24"/>
+                      <w:szCs w:val="24"/>
+                    </w:rPr>
+                    <w:t>inicio</w:t>
                   </w:r>
                   <w:proofErr w:type="spellEnd"/>
+                  <w:proofErr w:type="gramEnd"/>
                   <w:r>
                     <w:rPr>
                       <w:rFonts w:ascii="Arial" w:hAnsi="Arial" w:cs="Arial"/>
@@ -3023,9 +3610,19 @@
                       <w:sz w:val="24"/>
                       <w:szCs w:val="24"/>
                     </w:rPr>
-                    <w:t>sabado_inicio</w:t>
+                    <w:t>sabado_</w:t>
+                  </w:r>
+                  <w:proofErr w:type="gramStart"/>
+                  <w:r>
+                    <w:rPr>
+                      <w:rFonts w:ascii="Arial" w:hAnsi="Arial" w:cs="Arial"/>
+                      <w:sz w:val="24"/>
+                      <w:szCs w:val="24"/>
+                    </w:rPr>
+                    <w:t>inicio</w:t>
                   </w:r>
                   <w:proofErr w:type="spellEnd"/>
+                  <w:proofErr w:type="gramEnd"/>
                   <w:r>
                     <w:rPr>
                       <w:rFonts w:ascii="Arial" w:hAnsi="Arial" w:cs="Arial"/>
@@ -3089,9 +3686,19 @@
                       <w:sz w:val="24"/>
                       <w:szCs w:val="24"/>
                     </w:rPr>
-                    <w:t>sabado_intervalo_inicio</w:t>
+                    <w:t>sabado_intervalo_</w:t>
+                  </w:r>
+                  <w:proofErr w:type="gramStart"/>
+                  <w:r>
+                    <w:rPr>
+                      <w:rFonts w:ascii="Arial" w:hAnsi="Arial" w:cs="Arial"/>
+                      <w:sz w:val="24"/>
+                      <w:szCs w:val="24"/>
+                    </w:rPr>
+                    <w:t>inicio</w:t>
                   </w:r>
                   <w:proofErr w:type="spellEnd"/>
+                  <w:proofErr w:type="gramEnd"/>
                   <w:r>
                     <w:rPr>
                       <w:rFonts w:ascii="Arial" w:hAnsi="Arial" w:cs="Arial"/>
@@ -3156,6 +3763,7 @@
               <w:t>jornada_diaria</w:t>
             </w:r>
             <w:proofErr w:type="spellEnd"/>
+            <w:proofErr w:type="gramStart"/>
             <w:r>
               <w:rPr>
                 <w:rFonts w:ascii="Arial" w:hAnsi="Arial" w:cs="Arial"/>
@@ -3163,7 +3771,37 @@
                 <w:sz w:val="24"/>
                 <w:szCs w:val="24"/>
               </w:rPr>
-              <w:t>}}  Total da jornada semanal:  {{</w:t>
+              <w:t>}}  Total</w:t>
+            </w:r>
+            <w:proofErr w:type="gramEnd"/>
+            <w:r>
+              <w:rPr>
+                <w:rFonts w:ascii="Arial" w:hAnsi="Arial" w:cs="Arial"/>
+                <w:b/>
+                <w:sz w:val="24"/>
+                <w:szCs w:val="24"/>
+              </w:rPr>
+              <w:t xml:space="preserve"> da jornada semanal</w:t>
+            </w:r>
+            <w:proofErr w:type="gramStart"/>
+            <w:r>
+              <w:rPr>
+                <w:rFonts w:ascii="Arial" w:hAnsi="Arial" w:cs="Arial"/>
+                <w:b/>
+                <w:sz w:val="24"/>
+                <w:szCs w:val="24"/>
+              </w:rPr>
+              <w:t>:  {</w:t>
+            </w:r>
+            <w:proofErr w:type="gramEnd"/>
+            <w:r>
+              <w:rPr>
+                <w:rFonts w:ascii="Arial" w:hAnsi="Arial" w:cs="Arial"/>
+                <w:b/>
+                <w:sz w:val="24"/>
+                <w:szCs w:val="24"/>
+              </w:rPr>
+              <w:t>{</w:t>
             </w:r>
             <w:proofErr w:type="spellStart"/>
             <w:r>
@@ -3429,7 +4067,25 @@
           <w:sz w:val="24"/>
           <w:szCs w:val="24"/>
         </w:rPr>
-        <w:t xml:space="preserve">Concessão do período de recesso de 30 (trinta) dias a ser gozado preferencialmente durante as férias escolares, no caso do estágio ter a duração igual ou superior a 1 (um) ano, ou ainda, proporcional nos casos de duração inferior; </w:t>
+        <w:t xml:space="preserve">Concessão do período de recesso de 30 (trinta) dias a ser gozado preferencialmente durante as férias escolares, no caso </w:t>
+      </w:r>
+      <w:proofErr w:type="gramStart"/>
+      <w:r>
+        <w:rPr>
+          <w:rFonts w:ascii="Arial" w:hAnsi="Arial" w:cs="Arial"/>
+          <w:sz w:val="24"/>
+          <w:szCs w:val="24"/>
+        </w:rPr>
+        <w:t>do</w:t>
+      </w:r>
+      <w:proofErr w:type="gramEnd"/>
+      <w:r>
+        <w:rPr>
+          <w:rFonts w:ascii="Arial" w:hAnsi="Arial" w:cs="Arial"/>
+          <w:sz w:val="24"/>
+          <w:szCs w:val="24"/>
+        </w:rPr>
+        <w:t xml:space="preserve"> estágio ter a duração igual ou superior a 1 (um) ano, ou ainda, proporcional nos casos de duração inferior; </w:t>
       </w:r>
     </w:p>
     <w:p>

</xml_diff>